<commit_message>
Added Release and Resources .ico and .png files.
</commit_message>
<xml_diff>
--- a/Documentation/IpcNetMq.docx
+++ b/Documentation/IpcNetMq.docx
@@ -68,7 +68,7 @@
           <w:r>
             <w:fldChar w:fldCharType="separate"/>
           </w:r>
-          <w:hyperlink w:anchor="_Toc172533611" w:history="1">
+          <w:hyperlink w:anchor="_Toc180829183" w:history="1">
             <w:r>
               <w:rPr>
                 <w:rStyle w:val="Hyperlink"/>
@@ -95,7 +95,7 @@
                 <w:noProof/>
                 <w:webHidden/>
               </w:rPr>
-              <w:instrText xml:space="preserve"> PAGEREF _Toc172533611 \h </w:instrText>
+              <w:instrText xml:space="preserve"> PAGEREF _Toc180829183 \h </w:instrText>
             </w:r>
             <w:r>
               <w:rPr>
@@ -139,7 +139,7 @@
               <w:szCs w:val="24"/>
             </w:rPr>
           </w:pPr>
-          <w:hyperlink w:anchor="_Toc172533612" w:history="1">
+          <w:hyperlink w:anchor="_Toc180829184" w:history="1">
             <w:r>
               <w:rPr>
                 <w:rStyle w:val="Hyperlink"/>
@@ -166,7 +166,7 @@
                 <w:noProof/>
                 <w:webHidden/>
               </w:rPr>
-              <w:instrText xml:space="preserve"> PAGEREF _Toc172533612 \h </w:instrText>
+              <w:instrText xml:space="preserve"> PAGEREF _Toc180829184 \h </w:instrText>
             </w:r>
             <w:r>
               <w:rPr>
@@ -186,7 +186,7 @@
                 <w:noProof/>
                 <w:webHidden/>
               </w:rPr>
-              <w:t>2</w:t>
+              <w:t>3</w:t>
             </w:r>
             <w:r>
               <w:rPr>
@@ -210,13 +210,13 @@
               <w:szCs w:val="24"/>
             </w:rPr>
           </w:pPr>
-          <w:hyperlink w:anchor="_Toc172533613" w:history="1">
+          <w:hyperlink w:anchor="_Toc180829185" w:history="1">
             <w:r>
               <w:rPr>
                 <w:rStyle w:val="Hyperlink"/>
                 <w:noProof/>
               </w:rPr>
-              <w:t>Example Simio Project</w:t>
+              <w:t>Example Projects</w:t>
             </w:r>
             <w:r>
               <w:rPr>
@@ -237,7 +237,7 @@
                 <w:noProof/>
                 <w:webHidden/>
               </w:rPr>
-              <w:instrText xml:space="preserve"> PAGEREF _Toc172533613 \h </w:instrText>
+              <w:instrText xml:space="preserve"> PAGEREF _Toc180829185 \h </w:instrText>
             </w:r>
             <w:r>
               <w:rPr>
@@ -257,7 +257,7 @@
                 <w:noProof/>
                 <w:webHidden/>
               </w:rPr>
-              <w:t>3</w:t>
+              <w:t>4</w:t>
             </w:r>
             <w:r>
               <w:rPr>
@@ -281,7 +281,7 @@
               <w:szCs w:val="24"/>
             </w:rPr>
           </w:pPr>
-          <w:hyperlink w:anchor="_Toc172533614" w:history="1">
+          <w:hyperlink w:anchor="_Toc180829186" w:history="1">
             <w:r>
               <w:rPr>
                 <w:rStyle w:val="Hyperlink"/>
@@ -308,7 +308,7 @@
                 <w:noProof/>
                 <w:webHidden/>
               </w:rPr>
-              <w:instrText xml:space="preserve"> PAGEREF _Toc172533614 \h </w:instrText>
+              <w:instrText xml:space="preserve"> PAGEREF _Toc180829186 \h </w:instrText>
             </w:r>
             <w:r>
               <w:rPr>
@@ -328,7 +328,7 @@
                 <w:noProof/>
                 <w:webHidden/>
               </w:rPr>
-              <w:t>6</w:t>
+              <w:t>5</w:t>
             </w:r>
             <w:r>
               <w:rPr>
@@ -352,7 +352,7 @@
               <w:szCs w:val="24"/>
             </w:rPr>
           </w:pPr>
-          <w:hyperlink w:anchor="_Toc172533615" w:history="1">
+          <w:hyperlink w:anchor="_Toc180829187" w:history="1">
             <w:r>
               <w:rPr>
                 <w:rStyle w:val="Hyperlink"/>
@@ -379,7 +379,78 @@
                 <w:noProof/>
                 <w:webHidden/>
               </w:rPr>
-              <w:instrText xml:space="preserve"> PAGEREF _Toc172533615 \h </w:instrText>
+              <w:instrText xml:space="preserve"> PAGEREF _Toc180829187 \h </w:instrText>
+            </w:r>
+            <w:r>
+              <w:rPr>
+                <w:noProof/>
+                <w:webHidden/>
+              </w:rPr>
+            </w:r>
+            <w:r>
+              <w:rPr>
+                <w:noProof/>
+                <w:webHidden/>
+              </w:rPr>
+              <w:fldChar w:fldCharType="separate"/>
+            </w:r>
+            <w:r>
+              <w:rPr>
+                <w:noProof/>
+                <w:webHidden/>
+              </w:rPr>
+              <w:t>5</w:t>
+            </w:r>
+            <w:r>
+              <w:rPr>
+                <w:noProof/>
+                <w:webHidden/>
+              </w:rPr>
+              <w:fldChar w:fldCharType="end"/>
+            </w:r>
+          </w:hyperlink>
+        </w:p>
+        <w:p>
+          <w:pPr>
+            <w:pStyle w:val="TOC2"/>
+            <w:tabs>
+              <w:tab w:val="right" w:leader="dot" w:pos="9350"/>
+            </w:tabs>
+            <w:rPr>
+              <w:rFonts w:eastAsiaTheme="minorEastAsia"/>
+              <w:noProof/>
+              <w:sz w:val="24"/>
+              <w:szCs w:val="24"/>
+            </w:rPr>
+          </w:pPr>
+          <w:hyperlink w:anchor="_Toc180829188" w:history="1">
+            <w:r>
+              <w:rPr>
+                <w:rStyle w:val="Hyperlink"/>
+                <w:noProof/>
+              </w:rPr>
+              <w:t>Diagnostics</w:t>
+            </w:r>
+            <w:r>
+              <w:rPr>
+                <w:noProof/>
+                <w:webHidden/>
+              </w:rPr>
+              <w:tab/>
+            </w:r>
+            <w:r>
+              <w:rPr>
+                <w:noProof/>
+                <w:webHidden/>
+              </w:rPr>
+              <w:fldChar w:fldCharType="begin"/>
+            </w:r>
+            <w:r>
+              <w:rPr>
+                <w:noProof/>
+                <w:webHidden/>
+              </w:rPr>
+              <w:instrText xml:space="preserve"> PAGEREF _Toc180829188 \h </w:instrText>
             </w:r>
             <w:r>
               <w:rPr>
@@ -423,13 +494,13 @@
               <w:szCs w:val="24"/>
             </w:rPr>
           </w:pPr>
-          <w:hyperlink w:anchor="_Toc172533616" w:history="1">
+          <w:hyperlink w:anchor="_Toc180829189" w:history="1">
             <w:r>
               <w:rPr>
                 <w:rStyle w:val="Hyperlink"/>
                 <w:noProof/>
               </w:rPr>
-              <w:t>Appendix – SimioPacket</w:t>
+              <w:t>Appendix – IpcPacket</w:t>
             </w:r>
             <w:r>
               <w:rPr>
@@ -450,7 +521,7 @@
                 <w:noProof/>
                 <w:webHidden/>
               </w:rPr>
-              <w:instrText xml:space="preserve"> PAGEREF _Toc172533616 \h </w:instrText>
+              <w:instrText xml:space="preserve"> PAGEREF _Toc180829189 \h </w:instrText>
             </w:r>
             <w:r>
               <w:rPr>
@@ -470,7 +541,7 @@
                 <w:noProof/>
                 <w:webHidden/>
               </w:rPr>
-              <w:t>8</w:t>
+              <w:t>7</w:t>
             </w:r>
             <w:r>
               <w:rPr>
@@ -494,13 +565,13 @@
               <w:szCs w:val="24"/>
             </w:rPr>
           </w:pPr>
-          <w:hyperlink w:anchor="_Toc172533617" w:history="1">
+          <w:hyperlink w:anchor="_Toc180829190" w:history="1">
             <w:r>
               <w:rPr>
                 <w:rStyle w:val="Hyperlink"/>
                 <w:noProof/>
               </w:rPr>
-              <w:t>Version V240301</w:t>
+              <w:t>Version V241007</w:t>
             </w:r>
             <w:r>
               <w:rPr>
@@ -521,7 +592,78 @@
                 <w:noProof/>
                 <w:webHidden/>
               </w:rPr>
-              <w:instrText xml:space="preserve"> PAGEREF _Toc172533617 \h </w:instrText>
+              <w:instrText xml:space="preserve"> PAGEREF _Toc180829190 \h </w:instrText>
+            </w:r>
+            <w:r>
+              <w:rPr>
+                <w:noProof/>
+                <w:webHidden/>
+              </w:rPr>
+            </w:r>
+            <w:r>
+              <w:rPr>
+                <w:noProof/>
+                <w:webHidden/>
+              </w:rPr>
+              <w:fldChar w:fldCharType="separate"/>
+            </w:r>
+            <w:r>
+              <w:rPr>
+                <w:noProof/>
+                <w:webHidden/>
+              </w:rPr>
+              <w:t>7</w:t>
+            </w:r>
+            <w:r>
+              <w:rPr>
+                <w:noProof/>
+                <w:webHidden/>
+              </w:rPr>
+              <w:fldChar w:fldCharType="end"/>
+            </w:r>
+          </w:hyperlink>
+        </w:p>
+        <w:p>
+          <w:pPr>
+            <w:pStyle w:val="TOC1"/>
+            <w:tabs>
+              <w:tab w:val="right" w:leader="dot" w:pos="9350"/>
+            </w:tabs>
+            <w:rPr>
+              <w:rFonts w:eastAsiaTheme="minorEastAsia"/>
+              <w:noProof/>
+              <w:sz w:val="24"/>
+              <w:szCs w:val="24"/>
+            </w:rPr>
+          </w:pPr>
+          <w:hyperlink w:anchor="_Toc180829191" w:history="1">
+            <w:r>
+              <w:rPr>
+                <w:rStyle w:val="Hyperlink"/>
+                <w:noProof/>
+              </w:rPr>
+              <w:t>Appendix – Robustness</w:t>
+            </w:r>
+            <w:r>
+              <w:rPr>
+                <w:noProof/>
+                <w:webHidden/>
+              </w:rPr>
+              <w:tab/>
+            </w:r>
+            <w:r>
+              <w:rPr>
+                <w:noProof/>
+                <w:webHidden/>
+              </w:rPr>
+              <w:fldChar w:fldCharType="begin"/>
+            </w:r>
+            <w:r>
+              <w:rPr>
+                <w:noProof/>
+                <w:webHidden/>
+              </w:rPr>
+              <w:instrText xml:space="preserve"> PAGEREF _Toc180829191 \h </w:instrText>
             </w:r>
             <w:r>
               <w:rPr>
@@ -568,7 +710,7 @@
       <w:pPr>
         <w:pStyle w:val="Heading1"/>
       </w:pPr>
-      <w:bookmarkStart w:id="0" w:name="_Toc172533611"/>
+      <w:bookmarkStart w:id="0" w:name="_Toc180829183"/>
       <w:r>
         <w:t>Overview</w:t>
       </w:r>
@@ -761,6 +903,7 @@
     </w:p>
     <w:p>
       <w:r>
+        <w:lastRenderedPageBreak/>
         <w:t>Examples of the external Server are provided in C# and Python.</w:t>
       </w:r>
     </w:p>
@@ -774,7 +917,6 @@
         </w:rPr>
       </w:pPr>
       <w:r>
-        <w:lastRenderedPageBreak/>
         <w:br w:type="page"/>
       </w:r>
     </w:p>
@@ -782,7 +924,7 @@
       <w:pPr>
         <w:pStyle w:val="Heading2"/>
       </w:pPr>
-      <w:bookmarkStart w:id="1" w:name="_Toc172533612"/>
+      <w:bookmarkStart w:id="1" w:name="_Toc180829184"/>
       <w:r>
         <w:lastRenderedPageBreak/>
         <w:t>Requirements</w:t>
@@ -867,15 +1009,15 @@
       <w:pPr>
         <w:pStyle w:val="Heading2"/>
       </w:pPr>
-      <w:bookmarkStart w:id="2" w:name="_Toc172533613"/>
+      <w:bookmarkStart w:id="2" w:name="_Toc180829185"/>
       <w:r>
         <w:lastRenderedPageBreak/>
         <w:t>Example Project</w:t>
       </w:r>
+      <w:r>
+        <w:t>s</w:t>
+      </w:r>
       <w:bookmarkEnd w:id="2"/>
-      <w:r>
-        <w:t>s</w:t>
-      </w:r>
     </w:p>
     <w:p/>
     <w:p>
@@ -990,7 +1132,7 @@
       <w:pPr>
         <w:pStyle w:val="Heading1"/>
       </w:pPr>
-      <w:bookmarkStart w:id="3" w:name="_Toc172533614"/>
+      <w:bookmarkStart w:id="3" w:name="_Toc180829186"/>
       <w:r>
         <w:lastRenderedPageBreak/>
         <w:t>Server-Client Pattern</w:t>
@@ -1046,7 +1188,7 @@
       <w:pPr>
         <w:pStyle w:val="Heading2"/>
       </w:pPr>
-      <w:bookmarkStart w:id="4" w:name="_Toc172533615"/>
+      <w:bookmarkStart w:id="4" w:name="_Toc180829187"/>
       <w:r>
         <w:t>Overview</w:t>
       </w:r>
@@ -1115,7 +1257,18 @@
         <w:pStyle w:val="Code"/>
       </w:pPr>
       <w:r>
-        <w:t>Create named pipe.</w:t>
+        <w:t xml:space="preserve">Create </w:t>
+      </w:r>
+      <w:proofErr w:type="spellStart"/>
+      <w:r>
+        <w:t>NetMq</w:t>
+      </w:r>
+      <w:proofErr w:type="spellEnd"/>
+      <w:r>
+        <w:t xml:space="preserve"> connection</w:t>
+      </w:r>
+      <w:r>
+        <w:t>.</w:t>
       </w:r>
     </w:p>
     <w:p>
@@ -1132,7 +1285,13 @@
       </w:pPr>
       <w:r>
         <w:tab/>
-        <w:t>While connected to the pipe.</w:t>
+        <w:t>While connect</w:t>
+      </w:r>
+      <w:r>
+        <w:t>ion is valid</w:t>
+      </w:r>
+      <w:r>
+        <w:t>.</w:t>
       </w:r>
     </w:p>
     <w:p>
@@ -1327,7 +1486,13 @@
         <w:t>” datagram</w:t>
       </w:r>
       <w:r>
-        <w:t xml:space="preserve">, but you should mind the buffer size of the named pipe and </w:t>
+        <w:t xml:space="preserve">, but you should mind the </w:t>
+      </w:r>
+      <w:r>
+        <w:t xml:space="preserve">memory consumption </w:t>
+      </w:r>
+      <w:r>
+        <w:t xml:space="preserve"> and </w:t>
       </w:r>
       <w:r>
         <w:t>construct</w:t>
@@ -1384,10 +1549,16 @@
     <w:p/>
     <w:p>
       <w:r>
-        <w:t>When the client (Simio) disconnects, it falls out of the loop and builds the named pipe again</w:t>
-      </w:r>
-      <w:r>
-        <w:t xml:space="preserve"> and the whole process begins again.</w:t>
+        <w:t xml:space="preserve">When the client  disconnects, it falls out of the loop and builds </w:t>
+      </w:r>
+      <w:r>
+        <w:t>a new connection</w:t>
+      </w:r>
+      <w:r>
+        <w:t xml:space="preserve"> </w:t>
+      </w:r>
+      <w:r>
+        <w:t>and the whole process begins again.</w:t>
       </w:r>
     </w:p>
     <w:p/>
@@ -1395,9 +1566,11 @@
       <w:pPr>
         <w:pStyle w:val="Heading2"/>
       </w:pPr>
+      <w:bookmarkStart w:id="5" w:name="_Toc180829188"/>
       <w:r>
         <w:t>Diagnostics</w:t>
       </w:r>
+      <w:bookmarkEnd w:id="5"/>
     </w:p>
     <w:p/>
     <w:p/>
@@ -1411,22 +1584,39 @@
       <w:pPr>
         <w:pStyle w:val="Heading1"/>
       </w:pPr>
-      <w:bookmarkStart w:id="5" w:name="_Toc172533616"/>
-      <w:r>
-        <w:t>Appendix – SimioPacket</w:t>
-      </w:r>
-      <w:bookmarkEnd w:id="5"/>
+      <w:bookmarkStart w:id="6" w:name="_Toc180829189"/>
+      <w:r>
+        <w:t xml:space="preserve">Appendix – </w:t>
+      </w:r>
+      <w:proofErr w:type="spellStart"/>
+      <w:r>
+        <w:t>Ipc</w:t>
+      </w:r>
+      <w:r>
+        <w:t>Packet</w:t>
+      </w:r>
+      <w:bookmarkEnd w:id="6"/>
+      <w:proofErr w:type="spellEnd"/>
     </w:p>
     <w:p/>
     <w:p>
       <w:pPr>
         <w:pStyle w:val="Heading2"/>
       </w:pPr>
-      <w:bookmarkStart w:id="6" w:name="_Toc172533617"/>
-      <w:r>
-        <w:t>Version V240301</w:t>
-      </w:r>
-      <w:bookmarkEnd w:id="6"/>
+      <w:bookmarkStart w:id="7" w:name="_Toc180829190"/>
+      <w:r>
+        <w:t>Version V24</w:t>
+      </w:r>
+      <w:r>
+        <w:t>10</w:t>
+      </w:r>
+      <w:r>
+        <w:t>0</w:t>
+      </w:r>
+      <w:r>
+        <w:t>7</w:t>
+      </w:r>
+      <w:bookmarkEnd w:id="7"/>
     </w:p>
     <w:p/>
     <w:p>
@@ -1511,7 +1701,452 @@
         <w:br w:type="page"/>
       </w:r>
     </w:p>
-    <w:p/>
+    <w:p>
+      <w:pPr>
+        <w:pStyle w:val="Heading1"/>
+      </w:pPr>
+      <w:bookmarkStart w:id="8" w:name="_Toc180829191"/>
+      <w:r>
+        <w:lastRenderedPageBreak/>
+        <w:t>Appendix – Robustness</w:t>
+      </w:r>
+      <w:bookmarkEnd w:id="8"/>
+    </w:p>
+    <w:p/>
+    <w:p>
+      <w:r>
+        <w:t>When building a robust **</w:t>
+      </w:r>
+      <w:proofErr w:type="spellStart"/>
+      <w:r>
+        <w:t>NetMQ</w:t>
+      </w:r>
+      <w:proofErr w:type="spellEnd"/>
+      <w:r>
+        <w:t>** REQ-REP application, handling edge cases such as clients starting before the server, clients crashing, or network interruptions are important considerations to make the system resilient. Here are a few strategies to handle these scenarios:</w:t>
+      </w:r>
+    </w:p>
+    <w:p/>
+    <w:p>
+      <w:r>
+        <w:t>### 1. **Clients Starting Before the Server**</w:t>
+      </w:r>
+    </w:p>
+    <w:p>
+      <w:r>
+        <w:t>This can happen when clients attempt to connect to the server before it has finished starting up. The REQ-REP pattern requires an established connection, and if the server isn't available, clients will fail to connect.</w:t>
+      </w:r>
+    </w:p>
+    <w:p/>
+    <w:p>
+      <w:r>
+        <w:t>#### Solution:</w:t>
+      </w:r>
+    </w:p>
+    <w:p>
+      <w:r>
+        <w:t>- **Retry Logic**: Implement retry logic on the client side. If the client tries to send a request and the server is not up, it should wait for a moment and then retry connecting.</w:t>
+      </w:r>
+    </w:p>
+    <w:p>
+      <w:r>
+        <w:t xml:space="preserve">  </w:t>
+      </w:r>
+    </w:p>
+    <w:p>
+      <w:r>
+        <w:t xml:space="preserve">   Example:</w:t>
+      </w:r>
+    </w:p>
+    <w:p>
+      <w:r>
+        <w:t xml:space="preserve">   ```</w:t>
+      </w:r>
+      <w:proofErr w:type="spellStart"/>
+      <w:r>
+        <w:t>csharp</w:t>
+      </w:r>
+      <w:proofErr w:type="spellEnd"/>
+    </w:p>
+    <w:p>
+      <w:r>
+        <w:t xml:space="preserve">   while (!</w:t>
+      </w:r>
+      <w:proofErr w:type="spellStart"/>
+      <w:r>
+        <w:t>clientSocket.TryConnect</w:t>
+      </w:r>
+      <w:proofErr w:type="spellEnd"/>
+      <w:r>
+        <w:t>("</w:t>
+      </w:r>
+      <w:proofErr w:type="spellStart"/>
+      <w:r>
+        <w:t>tcp</w:t>
+      </w:r>
+      <w:proofErr w:type="spellEnd"/>
+      <w:r>
+        <w:t>://127.0.0.1:5555"))</w:t>
+      </w:r>
+    </w:p>
+    <w:p>
+      <w:r>
+        <w:t xml:space="preserve">   {</w:t>
+      </w:r>
+    </w:p>
+    <w:p>
+      <w:r>
+        <w:t xml:space="preserve">       </w:t>
+      </w:r>
+      <w:proofErr w:type="spellStart"/>
+      <w:r>
+        <w:t>Console.WriteLine</w:t>
+      </w:r>
+      <w:proofErr w:type="spellEnd"/>
+      <w:r>
+        <w:t>("Waiting for server to come online..."</w:t>
+      </w:r>
+      <w:proofErr w:type="gramStart"/>
+      <w:r>
+        <w:t>);</w:t>
+      </w:r>
+      <w:proofErr w:type="gramEnd"/>
+    </w:p>
+    <w:p>
+      <w:r>
+        <w:t xml:space="preserve">       await </w:t>
+      </w:r>
+      <w:proofErr w:type="spellStart"/>
+      <w:r>
+        <w:t>Task.Delay</w:t>
+      </w:r>
+      <w:proofErr w:type="spellEnd"/>
+      <w:r>
+        <w:t>(1000); // Wait and retry</w:t>
+      </w:r>
+    </w:p>
+    <w:p>
+      <w:r>
+        <w:t xml:space="preserve">   }</w:t>
+      </w:r>
+    </w:p>
+    <w:p>
+      <w:r>
+        <w:t xml:space="preserve">   ```</w:t>
+      </w:r>
+    </w:p>
+    <w:p>
+      <w:r>
+        <w:t>- **Exponential Backoff**: You can enhance the retry mechanism with an exponential backoff strategy, where the client waits increasingly longer between each retry attempt.</w:t>
+      </w:r>
+    </w:p>
+    <w:p/>
+    <w:p>
+      <w:r>
+        <w:t>- **Timeouts**: Set timeouts on the connection attempts, so that clients don’t hang indefinitely when waiting for the server to become available.</w:t>
+      </w:r>
+    </w:p>
+    <w:p/>
+    <w:p>
+      <w:r>
+        <w:t>### 2. **Clients Crashing Before Receiving a Response**</w:t>
+      </w:r>
+    </w:p>
+    <w:p>
+      <w:r>
+        <w:lastRenderedPageBreak/>
+        <w:t>This can happen if a client crashes after sending a request but before receiving the response, which could lead to incomplete request processing on the server side.</w:t>
+      </w:r>
+    </w:p>
+    <w:p/>
+    <w:p>
+      <w:r>
+        <w:t>#### Solution:</w:t>
+      </w:r>
+    </w:p>
+    <w:p>
+      <w:r>
+        <w:t>- **Idempotency**: Design the client requests to be idempotent, meaning the same request can be safely retried without causing inconsistent state on the server. This allows a client to send the same request again without worrying about duplicated processing.</w:t>
+      </w:r>
+    </w:p>
+    <w:p>
+      <w:r>
+        <w:t xml:space="preserve">  </w:t>
+      </w:r>
+    </w:p>
+    <w:p>
+      <w:r>
+        <w:t xml:space="preserve">- **Heartbeats and Keep-Alive**: Use heartbeat mechanisms (e.g., </w:t>
+      </w:r>
+      <w:proofErr w:type="spellStart"/>
+      <w:r>
+        <w:t>NetMQ's</w:t>
+      </w:r>
+      <w:proofErr w:type="spellEnd"/>
+      <w:r>
+        <w:t xml:space="preserve"> `Poller` with `</w:t>
+      </w:r>
+      <w:proofErr w:type="spellStart"/>
+      <w:r>
+        <w:t>Socket.Options.SetHeartbeatInterval</w:t>
+      </w:r>
+      <w:proofErr w:type="spellEnd"/>
+      <w:r>
+        <w:t>`) to detect dead clients and remove them from the server’s queue if they crash or disconnect.</w:t>
+      </w:r>
+    </w:p>
+    <w:p/>
+    <w:p>
+      <w:r>
+        <w:t>- **Detecting Dead Clients**: The server should be able to detect when a client crashes or disconnects by setting a **receive timeout** and dropping dead clients. This prevents the server from being stuck waiting for clients that will never respond.</w:t>
+      </w:r>
+    </w:p>
+    <w:p>
+      <w:r>
+        <w:t xml:space="preserve">  </w:t>
+      </w:r>
+    </w:p>
+    <w:p>
+      <w:r>
+        <w:t xml:space="preserve">   Example:</w:t>
+      </w:r>
+    </w:p>
+    <w:p>
+      <w:r>
+        <w:t xml:space="preserve">   ```</w:t>
+      </w:r>
+      <w:proofErr w:type="spellStart"/>
+      <w:r>
+        <w:t>csharp</w:t>
+      </w:r>
+      <w:proofErr w:type="spellEnd"/>
+    </w:p>
+    <w:p>
+      <w:r>
+        <w:t xml:space="preserve">   </w:t>
+      </w:r>
+      <w:proofErr w:type="spellStart"/>
+      <w:r>
+        <w:t>serverSocket.Options.ReceiveTimeout</w:t>
+      </w:r>
+      <w:proofErr w:type="spellEnd"/>
+      <w:r>
+        <w:t xml:space="preserve"> = </w:t>
+      </w:r>
+      <w:proofErr w:type="spellStart"/>
+      <w:r>
+        <w:t>TimeSpan.FromSeconds</w:t>
+      </w:r>
+      <w:proofErr w:type="spellEnd"/>
+      <w:r>
+        <w:t>(5); // Server detects a dead client after 5 seconds.</w:t>
+      </w:r>
+    </w:p>
+    <w:p>
+      <w:r>
+        <w:t xml:space="preserve">   ```</w:t>
+      </w:r>
+    </w:p>
+    <w:p/>
+    <w:p>
+      <w:r>
+        <w:t>### 3. **Client or Server Network Interruption**</w:t>
+      </w:r>
+    </w:p>
+    <w:p>
+      <w:r>
+        <w:t>Network interruptions between the client and server can lead to lost messages or failed request/response cycles.</w:t>
+      </w:r>
+    </w:p>
+    <w:p/>
+    <w:p>
+      <w:r>
+        <w:t>#### Solution:</w:t>
+      </w:r>
+    </w:p>
+    <w:p>
+      <w:r>
+        <w:t>- **Reconnection Logic**: Implement reconnection logic on both the client and server. When the client loses connection, it should try to reconnect automatically. Similarly, if the server detects a lost connection, it should re-establish communication.</w:t>
+      </w:r>
+    </w:p>
+    <w:p/>
+    <w:p>
+      <w:r>
+        <w:lastRenderedPageBreak/>
+        <w:t xml:space="preserve">- **Message Queuing**: Use **intermediaries** or **dealers**/**routers** in </w:t>
+      </w:r>
+      <w:proofErr w:type="spellStart"/>
+      <w:r>
+        <w:t>NetMQ</w:t>
+      </w:r>
+      <w:proofErr w:type="spellEnd"/>
+      <w:r>
+        <w:t xml:space="preserve"> to buffer requests and ensure that clients and servers can recover from transient network failures without losing messages.</w:t>
+      </w:r>
+    </w:p>
+    <w:p/>
+    <w:p>
+      <w:r>
+        <w:t>- **Transaction Acknowledgment**: Implement an acknowledgment mechanism where the client expects confirmation from the server that the request was processed successfully. If the acknowledgment isn’t received, the client can resend the request.</w:t>
+      </w:r>
+    </w:p>
+    <w:p/>
+    <w:p>
+      <w:r>
+        <w:t>### 4. **Server Crashing or Restarting**</w:t>
+      </w:r>
+    </w:p>
+    <w:p>
+      <w:r>
+        <w:t>If the server crashes or is restarted while the clients are still running, clients should be able to gracefully handle this situation.</w:t>
+      </w:r>
+    </w:p>
+    <w:p/>
+    <w:p>
+      <w:r>
+        <w:t>#### Solution:</w:t>
+      </w:r>
+    </w:p>
+    <w:p>
+      <w:r>
+        <w:t xml:space="preserve">- **Server Auto-Reconnect**: On the client side, make use of </w:t>
+      </w:r>
+      <w:proofErr w:type="spellStart"/>
+      <w:r>
+        <w:t>NetMQ's</w:t>
+      </w:r>
+      <w:proofErr w:type="spellEnd"/>
+      <w:r>
+        <w:t xml:space="preserve"> automatic reconnect feature. The client can automatically attempt to reconnect to the server after the server restarts.</w:t>
+      </w:r>
+    </w:p>
+    <w:p>
+      <w:r>
+        <w:t xml:space="preserve">  </w:t>
+      </w:r>
+    </w:p>
+    <w:p>
+      <w:r>
+        <w:t>- **Failover Mechanism**: Implement a failover strategy with backup servers. If one server goes down, the client can switch to another server. You can achieve this by setting up multiple endpoints for the client to connect to.</w:t>
+      </w:r>
+    </w:p>
+    <w:p/>
+    <w:p>
+      <w:r>
+        <w:t>### 5. **Graceful Shutdowns**</w:t>
+      </w:r>
+    </w:p>
+    <w:p>
+      <w:r>
+        <w:t>Ensure that both the client and server can shut down gracefully without leaving open connections or orphaned sockets.</w:t>
+      </w:r>
+    </w:p>
+    <w:p/>
+    <w:p>
+      <w:r>
+        <w:t>#### Solution:</w:t>
+      </w:r>
+    </w:p>
+    <w:p>
+      <w:r>
+        <w:t>- **Shutdown Signals**: Use a special "shutdown" message to inform the other party (client or server) that it is about to close. This ensures that ongoing operations can be completed before the shutdown occurs.</w:t>
+      </w:r>
+    </w:p>
+    <w:p>
+      <w:r>
+        <w:t>- **Dispose Sockets Properly**: Always ensure that sockets are properly disposed of when shutting down a client or server to prevent resource leakage.</w:t>
+      </w:r>
+    </w:p>
+    <w:p/>
+    <w:p>
+      <w:r>
+        <w:t>### 6. **Handling Message Size Limits**</w:t>
+      </w:r>
+    </w:p>
+    <w:p>
+      <w:r>
+        <w:lastRenderedPageBreak/>
+        <w:t>There might be scenarios where the messages being sent between clients and servers exceed the size that can be handled efficiently.</w:t>
+      </w:r>
+    </w:p>
+    <w:p/>
+    <w:p>
+      <w:r>
+        <w:t>#### Solution:</w:t>
+      </w:r>
+    </w:p>
+    <w:p>
+      <w:r>
+        <w:t>- **Chunking Messages**: Break larger messages into smaller chunks and send them sequentially, ensuring the server reconstructs the original message after all chunks are received.</w:t>
+      </w:r>
+    </w:p>
+    <w:p/>
+    <w:p>
+      <w:r>
+        <w:t>### 7. **Logging and Monitoring**</w:t>
+      </w:r>
+    </w:p>
+    <w:p>
+      <w:r>
+        <w:t>Always have detailed logging and monitoring to diagnose and handle edge cases in real time.</w:t>
+      </w:r>
+    </w:p>
+    <w:p/>
+    <w:p>
+      <w:r>
+        <w:t>#### Solution:</w:t>
+      </w:r>
+    </w:p>
+    <w:p>
+      <w:r>
+        <w:t>- Use **structured logging** to log the connection status, errors, and retries.</w:t>
+      </w:r>
+    </w:p>
+    <w:p>
+      <w:r>
+        <w:t>- Consider using **application monitoring tools** (like Prometheus or Grafana) to track socket health, message flow, and server status.</w:t>
+      </w:r>
+    </w:p>
+    <w:p/>
+    <w:p>
+      <w:r>
+        <w:t>### Summary:</w:t>
+      </w:r>
+    </w:p>
+    <w:p>
+      <w:r>
+        <w:t>- Implement **retry** and **reconnection** logic to handle cases where clients start before the server or experience network interruptions.</w:t>
+      </w:r>
+    </w:p>
+    <w:p>
+      <w:r>
+        <w:t>- Use **timeouts**, **heartbeats**, and **keep-alive** mechanisms to detect and handle client crashes.</w:t>
+      </w:r>
+    </w:p>
+    <w:p>
+      <w:r>
+        <w:t>- Consider designing **idempotent** requests and using **message acknowledgments** to ensure safe retries.</w:t>
+      </w:r>
+    </w:p>
+    <w:p>
+      <w:r>
+        <w:t>- Gracefully handle shutdowns to ensure that the system cleans up resources properly.</w:t>
+      </w:r>
+    </w:p>
+    <w:p/>
+    <w:p>
+      <w:r>
+        <w:t xml:space="preserve">By covering these edge cases, you can build a more resilient and reliable </w:t>
+      </w:r>
+      <w:proofErr w:type="spellStart"/>
+      <w:r>
+        <w:t>NetMQ</w:t>
+      </w:r>
+      <w:proofErr w:type="spellEnd"/>
+      <w:r>
+        <w:t>-based REQ-REP system that can recover from various failure scenarios.</w:t>
+      </w:r>
+    </w:p>
     <w:sectPr>
       <w:pgSz w:w="12240" w:h="15840"/>
       <w:pgMar w:top="1440" w:right="1440" w:bottom="1440" w:left="1440" w:header="720" w:footer="720" w:gutter="0"/>

</xml_diff>

<commit_message>
Changed targets: Dropped net6 and added net10. Built with vs2026
</commit_message>
<xml_diff>
--- a/Documentation/IpcNetMq.docx
+++ b/Documentation/IpcNetMq.docx
@@ -1,6 +1,6 @@
 
 <file path=word/document.xml><?xml version="1.0" encoding="utf-8"?>
-<w:document xmlns:wpc="http://schemas.microsoft.com/office/word/2010/wordprocessingCanvas" xmlns:cx="http://schemas.microsoft.com/office/drawing/2014/chartex" xmlns:cx1="http://schemas.microsoft.com/office/drawing/2015/9/8/chartex" xmlns:cx2="http://schemas.microsoft.com/office/drawing/2015/10/21/chartex" xmlns:cx3="http://schemas.microsoft.com/office/drawing/2016/5/9/chartex" xmlns:cx4="http://schemas.microsoft.com/office/drawing/2016/5/10/chartex" xmlns:cx5="http://schemas.microsoft.com/office/drawing/2016/5/11/chartex" xmlns:cx6="http://schemas.microsoft.com/office/drawing/2016/5/12/chartex" xmlns:cx7="http://schemas.microsoft.com/office/drawing/2016/5/13/chartex" xmlns:cx8="http://schemas.microsoft.com/office/drawing/2016/5/14/chartex" xmlns:mc="http://schemas.openxmlformats.org/markup-compatibility/2006" xmlns:aink="http://schemas.microsoft.com/office/drawing/2016/ink" xmlns:am3d="http://schemas.microsoft.com/office/drawing/2017/model3d" xmlns:o="urn:schemas-microsoft-com:office:office" xmlns:oel="http://schemas.microsoft.com/office/2019/extlst" xmlns:r="http://schemas.openxmlformats.org/officeDocument/2006/relationships" xmlns:m="http://schemas.openxmlformats.org/officeDocument/2006/math" xmlns:v="urn:schemas-microsoft-com:vml" xmlns:wp14="http://schemas.microsoft.com/office/word/2010/wordprocessingDrawing" xmlns:wp="http://schemas.openxmlformats.org/drawingml/2006/wordprocessingDrawing" xmlns:w10="urn:schemas-microsoft-com:office:word" xmlns:w="http://schemas.openxmlformats.org/wordprocessingml/2006/main" xmlns:w14="http://schemas.microsoft.com/office/word/2010/wordml" xmlns:w15="http://schemas.microsoft.com/office/word/2012/wordml" xmlns:w16cex="http://schemas.microsoft.com/office/word/2018/wordml/cex" xmlns:w16cid="http://schemas.microsoft.com/office/word/2016/wordml/cid" xmlns:w16="http://schemas.microsoft.com/office/word/2018/wordml" xmlns:w16du="http://schemas.microsoft.com/office/word/2023/wordml/word16du" xmlns:w16sdtdh="http://schemas.microsoft.com/office/word/2020/wordml/sdtdatahash" xmlns:w16se="http://schemas.microsoft.com/office/word/2015/wordml/symex" xmlns:wpg="http://schemas.microsoft.com/office/word/2010/wordprocessingGroup" xmlns:wpi="http://schemas.microsoft.com/office/word/2010/wordprocessingInk" xmlns:wne="http://schemas.microsoft.com/office/word/2006/wordml" xmlns:wps="http://schemas.microsoft.com/office/word/2010/wordprocessingShape" mc:Ignorable="w14 w15 w16se w16cid w16 w16cex w16sdtdh w16du wp14">
+<w:document xmlns:wpc="http://schemas.microsoft.com/office/word/2010/wordprocessingCanvas" xmlns:cx="http://schemas.microsoft.com/office/drawing/2014/chartex" xmlns:cx1="http://schemas.microsoft.com/office/drawing/2015/9/8/chartex" xmlns:cx2="http://schemas.microsoft.com/office/drawing/2015/10/21/chartex" xmlns:cx3="http://schemas.microsoft.com/office/drawing/2016/5/9/chartex" xmlns:cx4="http://schemas.microsoft.com/office/drawing/2016/5/10/chartex" xmlns:cx5="http://schemas.microsoft.com/office/drawing/2016/5/11/chartex" xmlns:cx6="http://schemas.microsoft.com/office/drawing/2016/5/12/chartex" xmlns:cx7="http://schemas.microsoft.com/office/drawing/2016/5/13/chartex" xmlns:cx8="http://schemas.microsoft.com/office/drawing/2016/5/14/chartex" xmlns:mc="http://schemas.openxmlformats.org/markup-compatibility/2006" xmlns:aink="http://schemas.microsoft.com/office/drawing/2016/ink" xmlns:am3d="http://schemas.microsoft.com/office/drawing/2017/model3d" xmlns:o="urn:schemas-microsoft-com:office:office" xmlns:oel="http://schemas.microsoft.com/office/2019/extlst" xmlns:r="http://schemas.openxmlformats.org/officeDocument/2006/relationships" xmlns:m="http://schemas.openxmlformats.org/officeDocument/2006/math" xmlns:v="urn:schemas-microsoft-com:vml" xmlns:wp14="http://schemas.microsoft.com/office/word/2010/wordprocessingDrawing" xmlns:wp="http://schemas.openxmlformats.org/drawingml/2006/wordprocessingDrawing" xmlns:w10="urn:schemas-microsoft-com:office:word" xmlns:w="http://schemas.openxmlformats.org/wordprocessingml/2006/main" xmlns:w14="http://schemas.microsoft.com/office/word/2010/wordml" xmlns:w15="http://schemas.microsoft.com/office/word/2012/wordml" xmlns:w16cex="http://schemas.microsoft.com/office/word/2018/wordml/cex" xmlns:w16cid="http://schemas.microsoft.com/office/word/2016/wordml/cid" xmlns:w16="http://schemas.microsoft.com/office/word/2018/wordml" xmlns:w16du="http://schemas.microsoft.com/office/word/2023/wordml/word16du" xmlns:w16sdtdh="http://schemas.microsoft.com/office/word/2020/wordml/sdtdatahash" xmlns:w16sdtfl="http://schemas.microsoft.com/office/word/2024/wordml/sdtformatlock" xmlns:w16se="http://schemas.microsoft.com/office/word/2015/wordml/symex" xmlns:wpg="http://schemas.microsoft.com/office/word/2010/wordprocessingGroup" xmlns:wpi="http://schemas.microsoft.com/office/word/2010/wordprocessingInk" xmlns:wne="http://schemas.microsoft.com/office/word/2006/wordml" xmlns:wps="http://schemas.microsoft.com/office/word/2010/wordprocessingShape" mc:Ignorable="w14 w15 w16se w16cid w16 w16cex w16sdtdh w16sdtfl w16du wp14">
   <w:body>
     <w:p>
       <w:pPr>
@@ -754,8 +754,21 @@
     </w:p>
     <w:p>
       <w:r>
-        <w:t>The entire project including examples servers is located on GitHub at ???</w:t>
-      </w:r>
+        <w:t xml:space="preserve">The entire project including examples servers is located on GitHub at </w:t>
+      </w:r>
+      <w:proofErr w:type="spellStart"/>
+      <w:r>
+        <w:t>batpox</w:t>
+      </w:r>
+      <w:proofErr w:type="spellEnd"/>
+      <w:r>
+        <w:t>\</w:t>
+      </w:r>
+      <w:proofErr w:type="spellStart"/>
+      <w:r>
+        <w:t>IpcNetMq</w:t>
+      </w:r>
+      <w:proofErr w:type="spellEnd"/>
     </w:p>
     <w:p>
       <w:r>
@@ -904,7 +917,26 @@
     <w:p>
       <w:r>
         <w:lastRenderedPageBreak/>
-        <w:t>Examples of the external Server are provided in C# and Python.</w:t>
+        <w:t>Examples of the external Server are provided in C# and Python</w:t>
+      </w:r>
+      <w:r>
+        <w:t xml:space="preserve"> in the Examples folder. There are </w:t>
+      </w:r>
+      <w:proofErr w:type="spellStart"/>
+      <w:r>
+        <w:t>wip</w:t>
+      </w:r>
+      <w:proofErr w:type="spellEnd"/>
+      <w:r>
+        <w:t xml:space="preserve"> folders for Kotlin and Java but </w:t>
+      </w:r>
+      <w:proofErr w:type="gramStart"/>
+      <w:r>
+        <w:t>not</w:t>
+      </w:r>
+      <w:proofErr w:type="gramEnd"/>
+      <w:r>
+        <w:t xml:space="preserve"> serviceable yet.</w:t>
       </w:r>
     </w:p>
     <w:p>
@@ -2158,7 +2190,7 @@
 </file>
 
 <file path=word/numbering.xml><?xml version="1.0" encoding="utf-8"?>
-<w:numbering xmlns:wpc="http://schemas.microsoft.com/office/word/2010/wordprocessingCanvas" xmlns:cx="http://schemas.microsoft.com/office/drawing/2014/chartex" xmlns:cx1="http://schemas.microsoft.com/office/drawing/2015/9/8/chartex" xmlns:cx2="http://schemas.microsoft.com/office/drawing/2015/10/21/chartex" xmlns:cx3="http://schemas.microsoft.com/office/drawing/2016/5/9/chartex" xmlns:cx4="http://schemas.microsoft.com/office/drawing/2016/5/10/chartex" xmlns:cx5="http://schemas.microsoft.com/office/drawing/2016/5/11/chartex" xmlns:cx6="http://schemas.microsoft.com/office/drawing/2016/5/12/chartex" xmlns:cx7="http://schemas.microsoft.com/office/drawing/2016/5/13/chartex" xmlns:cx8="http://schemas.microsoft.com/office/drawing/2016/5/14/chartex" xmlns:mc="http://schemas.openxmlformats.org/markup-compatibility/2006" xmlns:aink="http://schemas.microsoft.com/office/drawing/2016/ink" xmlns:am3d="http://schemas.microsoft.com/office/drawing/2017/model3d" xmlns:o="urn:schemas-microsoft-com:office:office" xmlns:oel="http://schemas.microsoft.com/office/2019/extlst" xmlns:r="http://schemas.openxmlformats.org/officeDocument/2006/relationships" xmlns:m="http://schemas.openxmlformats.org/officeDocument/2006/math" xmlns:v="urn:schemas-microsoft-com:vml" xmlns:wp14="http://schemas.microsoft.com/office/word/2010/wordprocessingDrawing" xmlns:wp="http://schemas.openxmlformats.org/drawingml/2006/wordprocessingDrawing" xmlns:w10="urn:schemas-microsoft-com:office:word" xmlns:w="http://schemas.openxmlformats.org/wordprocessingml/2006/main" xmlns:w14="http://schemas.microsoft.com/office/word/2010/wordml" xmlns:w15="http://schemas.microsoft.com/office/word/2012/wordml" xmlns:w16cex="http://schemas.microsoft.com/office/word/2018/wordml/cex" xmlns:w16cid="http://schemas.microsoft.com/office/word/2016/wordml/cid" xmlns:w16="http://schemas.microsoft.com/office/word/2018/wordml" xmlns:w16du="http://schemas.microsoft.com/office/word/2023/wordml/word16du" xmlns:w16sdtdh="http://schemas.microsoft.com/office/word/2020/wordml/sdtdatahash" xmlns:w16se="http://schemas.microsoft.com/office/word/2015/wordml/symex" xmlns:wpg="http://schemas.microsoft.com/office/word/2010/wordprocessingGroup" xmlns:wpi="http://schemas.microsoft.com/office/word/2010/wordprocessingInk" xmlns:wne="http://schemas.microsoft.com/office/word/2006/wordml" xmlns:wps="http://schemas.microsoft.com/office/word/2010/wordprocessingShape" mc:Ignorable="w14 w15 w16se w16cid w16 w16cex w16sdtdh w16du wp14">
+<w:numbering xmlns:wpc="http://schemas.microsoft.com/office/word/2010/wordprocessingCanvas" xmlns:cx="http://schemas.microsoft.com/office/drawing/2014/chartex" xmlns:cx1="http://schemas.microsoft.com/office/drawing/2015/9/8/chartex" xmlns:cx2="http://schemas.microsoft.com/office/drawing/2015/10/21/chartex" xmlns:cx3="http://schemas.microsoft.com/office/drawing/2016/5/9/chartex" xmlns:cx4="http://schemas.microsoft.com/office/drawing/2016/5/10/chartex" xmlns:cx5="http://schemas.microsoft.com/office/drawing/2016/5/11/chartex" xmlns:cx6="http://schemas.microsoft.com/office/drawing/2016/5/12/chartex" xmlns:cx7="http://schemas.microsoft.com/office/drawing/2016/5/13/chartex" xmlns:cx8="http://schemas.microsoft.com/office/drawing/2016/5/14/chartex" xmlns:mc="http://schemas.openxmlformats.org/markup-compatibility/2006" xmlns:aink="http://schemas.microsoft.com/office/drawing/2016/ink" xmlns:am3d="http://schemas.microsoft.com/office/drawing/2017/model3d" xmlns:o="urn:schemas-microsoft-com:office:office" xmlns:oel="http://schemas.microsoft.com/office/2019/extlst" xmlns:r="http://schemas.openxmlformats.org/officeDocument/2006/relationships" xmlns:m="http://schemas.openxmlformats.org/officeDocument/2006/math" xmlns:v="urn:schemas-microsoft-com:vml" xmlns:wp14="http://schemas.microsoft.com/office/word/2010/wordprocessingDrawing" xmlns:wp="http://schemas.openxmlformats.org/drawingml/2006/wordprocessingDrawing" xmlns:w10="urn:schemas-microsoft-com:office:word" xmlns:w="http://schemas.openxmlformats.org/wordprocessingml/2006/main" xmlns:w14="http://schemas.microsoft.com/office/word/2010/wordml" xmlns:w15="http://schemas.microsoft.com/office/word/2012/wordml" xmlns:w16cex="http://schemas.microsoft.com/office/word/2018/wordml/cex" xmlns:w16cid="http://schemas.microsoft.com/office/word/2016/wordml/cid" xmlns:w16="http://schemas.microsoft.com/office/word/2018/wordml" xmlns:w16du="http://schemas.microsoft.com/office/word/2023/wordml/word16du" xmlns:w16sdtdh="http://schemas.microsoft.com/office/word/2020/wordml/sdtdatahash" xmlns:w16sdtfl="http://schemas.microsoft.com/office/word/2024/wordml/sdtformatlock" xmlns:w16se="http://schemas.microsoft.com/office/word/2015/wordml/symex" xmlns:wpg="http://schemas.microsoft.com/office/word/2010/wordprocessingGroup" xmlns:wpi="http://schemas.microsoft.com/office/word/2010/wordprocessingInk" xmlns:wne="http://schemas.microsoft.com/office/word/2006/wordml" xmlns:wps="http://schemas.microsoft.com/office/word/2010/wordprocessingShape" mc:Ignorable="w14 w15 w16se w16cid w16 w16cex w16sdtdh w16sdtfl w16du wp14">
   <w:abstractNum w:abstractNumId="0" w15:restartNumberingAfterBreak="0">
     <w:nsid w:val="4ED46927"/>
     <w:multiLevelType w:val="hybridMultilevel"/>
@@ -2255,7 +2287,7 @@
 </file>
 
 <file path=word/styles.xml><?xml version="1.0" encoding="utf-8"?>
-<w:styles xmlns:mc="http://schemas.openxmlformats.org/markup-compatibility/2006" xmlns:r="http://schemas.openxmlformats.org/officeDocument/2006/relationships" xmlns:w="http://schemas.openxmlformats.org/wordprocessingml/2006/main" xmlns:w14="http://schemas.microsoft.com/office/word/2010/wordml" xmlns:w15="http://schemas.microsoft.com/office/word/2012/wordml" xmlns:w16cex="http://schemas.microsoft.com/office/word/2018/wordml/cex" xmlns:w16cid="http://schemas.microsoft.com/office/word/2016/wordml/cid" xmlns:w16="http://schemas.microsoft.com/office/word/2018/wordml" xmlns:w16du="http://schemas.microsoft.com/office/word/2023/wordml/word16du" xmlns:w16sdtdh="http://schemas.microsoft.com/office/word/2020/wordml/sdtdatahash" xmlns:w16se="http://schemas.microsoft.com/office/word/2015/wordml/symex" mc:Ignorable="w14 w15 w16se w16cid w16 w16cex w16sdtdh w16du">
+<w:styles xmlns:mc="http://schemas.openxmlformats.org/markup-compatibility/2006" xmlns:r="http://schemas.openxmlformats.org/officeDocument/2006/relationships" xmlns:w="http://schemas.openxmlformats.org/wordprocessingml/2006/main" xmlns:w14="http://schemas.microsoft.com/office/word/2010/wordml" xmlns:w15="http://schemas.microsoft.com/office/word/2012/wordml" xmlns:w16cex="http://schemas.microsoft.com/office/word/2018/wordml/cex" xmlns:w16cid="http://schemas.microsoft.com/office/word/2016/wordml/cid" xmlns:w16="http://schemas.microsoft.com/office/word/2018/wordml" xmlns:w16du="http://schemas.microsoft.com/office/word/2023/wordml/word16du" xmlns:w16sdtdh="http://schemas.microsoft.com/office/word/2020/wordml/sdtdatahash" xmlns:w16sdtfl="http://schemas.microsoft.com/office/word/2024/wordml/sdtformatlock" xmlns:w16se="http://schemas.microsoft.com/office/word/2015/wordml/symex" mc:Ignorable="w14 w15 w16se w16cid w16 w16cex w16sdtdh w16sdtfl w16du">
   <w:docDefaults>
     <w:rPrDefault>
       <w:rPr>

</xml_diff>

<commit_message>
Remove 'pure' async. Too fragile and unnecessary for most apps
</commit_message>
<xml_diff>
--- a/Documentation/IpcNetMq.docx
+++ b/Documentation/IpcNetMq.docx
@@ -68,7 +68,7 @@
           <w:r>
             <w:fldChar w:fldCharType="separate"/>
           </w:r>
-          <w:hyperlink w:anchor="_Toc180829183" w:history="1">
+          <w:hyperlink w:anchor="_Toc218708943" w:history="1">
             <w:r>
               <w:rPr>
                 <w:rStyle w:val="Hyperlink"/>
@@ -95,7 +95,7 @@
                 <w:noProof/>
                 <w:webHidden/>
               </w:rPr>
-              <w:instrText xml:space="preserve"> PAGEREF _Toc180829183 \h </w:instrText>
+              <w:instrText xml:space="preserve"> PAGEREF _Toc218708943 \h </w:instrText>
             </w:r>
             <w:r>
               <w:rPr>
@@ -139,7 +139,7 @@
               <w:szCs w:val="24"/>
             </w:rPr>
           </w:pPr>
-          <w:hyperlink w:anchor="_Toc180829184" w:history="1">
+          <w:hyperlink w:anchor="_Toc218708944" w:history="1">
             <w:r>
               <w:rPr>
                 <w:rStyle w:val="Hyperlink"/>
@@ -166,7 +166,7 @@
                 <w:noProof/>
                 <w:webHidden/>
               </w:rPr>
-              <w:instrText xml:space="preserve"> PAGEREF _Toc180829184 \h </w:instrText>
+              <w:instrText xml:space="preserve"> PAGEREF _Toc218708944 \h </w:instrText>
             </w:r>
             <w:r>
               <w:rPr>
@@ -210,7 +210,7 @@
               <w:szCs w:val="24"/>
             </w:rPr>
           </w:pPr>
-          <w:hyperlink w:anchor="_Toc180829185" w:history="1">
+          <w:hyperlink w:anchor="_Toc218708945" w:history="1">
             <w:r>
               <w:rPr>
                 <w:rStyle w:val="Hyperlink"/>
@@ -237,7 +237,7 @@
                 <w:noProof/>
                 <w:webHidden/>
               </w:rPr>
-              <w:instrText xml:space="preserve"> PAGEREF _Toc180829185 \h </w:instrText>
+              <w:instrText xml:space="preserve"> PAGEREF _Toc218708945 \h </w:instrText>
             </w:r>
             <w:r>
               <w:rPr>
@@ -281,7 +281,7 @@
               <w:szCs w:val="24"/>
             </w:rPr>
           </w:pPr>
-          <w:hyperlink w:anchor="_Toc180829186" w:history="1">
+          <w:hyperlink w:anchor="_Toc218708946" w:history="1">
             <w:r>
               <w:rPr>
                 <w:rStyle w:val="Hyperlink"/>
@@ -308,7 +308,7 @@
                 <w:noProof/>
                 <w:webHidden/>
               </w:rPr>
-              <w:instrText xml:space="preserve"> PAGEREF _Toc180829186 \h </w:instrText>
+              <w:instrText xml:space="preserve"> PAGEREF _Toc218708946 \h </w:instrText>
             </w:r>
             <w:r>
               <w:rPr>
@@ -352,7 +352,7 @@
               <w:szCs w:val="24"/>
             </w:rPr>
           </w:pPr>
-          <w:hyperlink w:anchor="_Toc180829187" w:history="1">
+          <w:hyperlink w:anchor="_Toc218708947" w:history="1">
             <w:r>
               <w:rPr>
                 <w:rStyle w:val="Hyperlink"/>
@@ -379,7 +379,7 @@
                 <w:noProof/>
                 <w:webHidden/>
               </w:rPr>
-              <w:instrText xml:space="preserve"> PAGEREF _Toc180829187 \h </w:instrText>
+              <w:instrText xml:space="preserve"> PAGEREF _Toc218708947 \h </w:instrText>
             </w:r>
             <w:r>
               <w:rPr>
@@ -423,7 +423,7 @@
               <w:szCs w:val="24"/>
             </w:rPr>
           </w:pPr>
-          <w:hyperlink w:anchor="_Toc180829188" w:history="1">
+          <w:hyperlink w:anchor="_Toc218708948" w:history="1">
             <w:r>
               <w:rPr>
                 <w:rStyle w:val="Hyperlink"/>
@@ -450,7 +450,7 @@
                 <w:noProof/>
                 <w:webHidden/>
               </w:rPr>
-              <w:instrText xml:space="preserve"> PAGEREF _Toc180829188 \h </w:instrText>
+              <w:instrText xml:space="preserve"> PAGEREF _Toc218708948 \h </w:instrText>
             </w:r>
             <w:r>
               <w:rPr>
@@ -494,7 +494,7 @@
               <w:szCs w:val="24"/>
             </w:rPr>
           </w:pPr>
-          <w:hyperlink w:anchor="_Toc180829189" w:history="1">
+          <w:hyperlink w:anchor="_Toc218708949" w:history="1">
             <w:r>
               <w:rPr>
                 <w:rStyle w:val="Hyperlink"/>
@@ -521,7 +521,7 @@
                 <w:noProof/>
                 <w:webHidden/>
               </w:rPr>
-              <w:instrText xml:space="preserve"> PAGEREF _Toc180829189 \h </w:instrText>
+              <w:instrText xml:space="preserve"> PAGEREF _Toc218708949 \h </w:instrText>
             </w:r>
             <w:r>
               <w:rPr>
@@ -565,7 +565,7 @@
               <w:szCs w:val="24"/>
             </w:rPr>
           </w:pPr>
-          <w:hyperlink w:anchor="_Toc180829190" w:history="1">
+          <w:hyperlink w:anchor="_Toc218708950" w:history="1">
             <w:r>
               <w:rPr>
                 <w:rStyle w:val="Hyperlink"/>
@@ -592,7 +592,7 @@
                 <w:noProof/>
                 <w:webHidden/>
               </w:rPr>
-              <w:instrText xml:space="preserve"> PAGEREF _Toc180829190 \h </w:instrText>
+              <w:instrText xml:space="preserve"> PAGEREF _Toc218708950 \h </w:instrText>
             </w:r>
             <w:r>
               <w:rPr>
@@ -636,7 +636,7 @@
               <w:szCs w:val="24"/>
             </w:rPr>
           </w:pPr>
-          <w:hyperlink w:anchor="_Toc180829191" w:history="1">
+          <w:hyperlink w:anchor="_Toc218708951" w:history="1">
             <w:r>
               <w:rPr>
                 <w:rStyle w:val="Hyperlink"/>
@@ -663,7 +663,7 @@
                 <w:noProof/>
                 <w:webHidden/>
               </w:rPr>
-              <w:instrText xml:space="preserve"> PAGEREF _Toc180829191 \h </w:instrText>
+              <w:instrText xml:space="preserve"> PAGEREF _Toc218708951 \h </w:instrText>
             </w:r>
             <w:r>
               <w:rPr>
@@ -710,7 +710,7 @@
       <w:pPr>
         <w:pStyle w:val="Heading1"/>
       </w:pPr>
-      <w:bookmarkStart w:id="0" w:name="_Toc180829183"/>
+      <w:bookmarkStart w:id="0" w:name="_Toc218708943"/>
       <w:r>
         <w:t>Overview</w:t>
       </w:r>
@@ -889,15 +889,7 @@
     </w:p>
     <w:p>
       <w:r>
-        <w:t xml:space="preserve">The entire </w:t>
-      </w:r>
-      <w:proofErr w:type="gramStart"/>
-      <w:r>
-        <w:t>round trip</w:t>
-      </w:r>
-      <w:proofErr w:type="gramEnd"/>
-      <w:r>
-        <w:t xml:space="preserve"> </w:t>
+        <w:t xml:space="preserve">The entire round trip </w:t>
       </w:r>
       <w:r>
         <w:t xml:space="preserve">mechanism has been clocked at </w:t>
@@ -910,13 +902,8 @@
       </w:r>
     </w:p>
     <w:p>
-      <w:proofErr w:type="gramStart"/>
-      <w:r>
-        <w:t>The communication</w:t>
-      </w:r>
-      <w:proofErr w:type="gramEnd"/>
-      <w:r>
-        <w:t xml:space="preserve"> is facilitated with a common </w:t>
+      <w:r>
+        <w:t xml:space="preserve">The communication is facilitated with a common </w:t>
       </w:r>
       <w:r>
         <w:t>Ipc</w:t>
@@ -971,15 +958,7 @@
       </w:r>
       <w:proofErr w:type="spellEnd"/>
       <w:r>
-        <w:t xml:space="preserve"> folders for Kotlin and </w:t>
-      </w:r>
-      <w:proofErr w:type="gramStart"/>
-      <w:r>
-        <w:t>Java</w:t>
-      </w:r>
-      <w:proofErr w:type="gramEnd"/>
-      <w:r>
-        <w:t xml:space="preserve"> but </w:t>
+        <w:t xml:space="preserve"> folders for Kotlin and Java but </w:t>
       </w:r>
       <w:r>
         <w:t>they are not</w:t>
@@ -1005,7 +984,7 @@
       <w:pPr>
         <w:pStyle w:val="Heading2"/>
       </w:pPr>
-      <w:bookmarkStart w:id="1" w:name="_Toc180829184"/>
+      <w:bookmarkStart w:id="1" w:name="_Toc218708944"/>
       <w:r>
         <w:lastRenderedPageBreak/>
         <w:t>Requirements</w:t>
@@ -1102,7 +1081,7 @@
       <w:pPr>
         <w:pStyle w:val="Heading2"/>
       </w:pPr>
-      <w:bookmarkStart w:id="2" w:name="_Toc180829185"/>
+      <w:bookmarkStart w:id="2" w:name="_Toc218708945"/>
       <w:r>
         <w:lastRenderedPageBreak/>
         <w:t>Example Project</w:t>
@@ -1224,7 +1203,7 @@
       <w:pPr>
         <w:pStyle w:val="Heading1"/>
       </w:pPr>
-      <w:bookmarkStart w:id="3" w:name="_Toc180829186"/>
+      <w:bookmarkStart w:id="3" w:name="_Toc218708946"/>
       <w:r>
         <w:lastRenderedPageBreak/>
         <w:t>Server-Client Pattern</w:t>
@@ -1280,7 +1259,7 @@
       <w:pPr>
         <w:pStyle w:val="Heading2"/>
       </w:pPr>
-      <w:bookmarkStart w:id="4" w:name="_Toc180829187"/>
+      <w:bookmarkStart w:id="4" w:name="_Toc218708947"/>
       <w:r>
         <w:t>Overview</w:t>
       </w:r>
@@ -1529,7 +1508,6 @@
       <w:r>
         <w:t xml:space="preserve"> As you might expect, the </w:t>
       </w:r>
-      <w:proofErr w:type="gramStart"/>
       <w:r>
         <w:t>R</w:t>
       </w:r>
@@ -1539,7 +1517,6 @@
       <w:r>
         <w:t>Reply</w:t>
       </w:r>
-      <w:proofErr w:type="gramEnd"/>
       <w:r>
         <w:t xml:space="preserve"> is handled synchronously. If you don’t care about the </w:t>
       </w:r>
@@ -1672,7 +1649,7 @@
       <w:pPr>
         <w:pStyle w:val="Heading2"/>
       </w:pPr>
-      <w:bookmarkStart w:id="5" w:name="_Toc180829188"/>
+      <w:bookmarkStart w:id="5" w:name="_Toc218708948"/>
       <w:r>
         <w:t>Diagnostics</w:t>
       </w:r>
@@ -1690,7 +1667,7 @@
       <w:pPr>
         <w:pStyle w:val="Heading1"/>
       </w:pPr>
-      <w:bookmarkStart w:id="6" w:name="_Toc180829189"/>
+      <w:bookmarkStart w:id="6" w:name="_Toc218708949"/>
       <w:r>
         <w:t xml:space="preserve">Appendix – </w:t>
       </w:r>
@@ -1709,7 +1686,7 @@
       <w:pPr>
         <w:pStyle w:val="Heading2"/>
       </w:pPr>
-      <w:bookmarkStart w:id="7" w:name="_Toc180829190"/>
+      <w:bookmarkStart w:id="7" w:name="_Toc218708950"/>
       <w:r>
         <w:t>Version V24</w:t>
       </w:r>
@@ -1753,6 +1730,13 @@
       <w:r>
         <w:t>Here is a sample of the json serialization:</w:t>
       </w:r>
+    </w:p>
+    <w:p>
+      <w:pPr>
+        <w:rPr>
+          <w:noProof/>
+        </w:rPr>
+      </w:pPr>
     </w:p>
     <w:p>
       <w:r>
@@ -1802,159 +1786,164 @@
         </w:drawing>
       </w:r>
     </w:p>
+    <w:p/>
+    <w:p>
+      <w:r>
+        <w:t>Version V260107</w:t>
+      </w:r>
+    </w:p>
+    <w:p/>
+    <w:p/>
+    <w:p/>
     <w:p>
       <w:r>
         <w:br w:type="page"/>
       </w:r>
     </w:p>
+    <w:p/>
     <w:p>
       <w:pPr>
         <w:pStyle w:val="Heading1"/>
       </w:pPr>
-      <w:bookmarkStart w:id="8" w:name="_Toc180829191"/>
+      <w:bookmarkStart w:id="8" w:name="_Toc218708951"/>
+      <w:r>
+        <w:t>Appendix – Robustness</w:t>
+      </w:r>
+      <w:bookmarkEnd w:id="8"/>
+    </w:p>
+    <w:p/>
+    <w:p>
+      <w:r>
+        <w:t>When building a robust **</w:t>
+      </w:r>
+      <w:proofErr w:type="spellStart"/>
+      <w:r>
+        <w:t>NetMQ</w:t>
+      </w:r>
+      <w:proofErr w:type="spellEnd"/>
+      <w:r>
+        <w:t>** REQ-REP application, handling edge cases such as clients starting before the server, clients crashing, or network interruptions are important considerations to make the system resilient. Here are a few strategies to handle these scenarios:</w:t>
+      </w:r>
+    </w:p>
+    <w:p/>
+    <w:p>
+      <w:r>
+        <w:t>### 1. **Clients Starting Before the Server**</w:t>
+      </w:r>
+    </w:p>
+    <w:p>
+      <w:r>
+        <w:t>This can happen when clients attempt to connect to the server before it has finished starting up. The REQ-REP pattern requires an established connection, and if the server isn't available, clients will fail to connect.</w:t>
+      </w:r>
+    </w:p>
+    <w:p/>
+    <w:p>
+      <w:r>
+        <w:t>#### Solution:</w:t>
+      </w:r>
+    </w:p>
+    <w:p>
+      <w:r>
+        <w:t>- **Retry Logic**: Implement retry logic on the client side. If the client tries to send a request and the server is not up, it should wait for a moment and then retry connecting.</w:t>
+      </w:r>
+    </w:p>
+    <w:p>
+      <w:r>
+        <w:t xml:space="preserve">  </w:t>
+      </w:r>
+    </w:p>
+    <w:p>
+      <w:r>
+        <w:t xml:space="preserve">   Example:</w:t>
+      </w:r>
+    </w:p>
+    <w:p>
+      <w:r>
+        <w:t xml:space="preserve">   ```</w:t>
+      </w:r>
+      <w:proofErr w:type="spellStart"/>
+      <w:r>
+        <w:t>csharp</w:t>
+      </w:r>
+      <w:proofErr w:type="spellEnd"/>
+    </w:p>
+    <w:p>
+      <w:r>
+        <w:t xml:space="preserve">   while (!</w:t>
+      </w:r>
+      <w:proofErr w:type="spellStart"/>
+      <w:r>
+        <w:t>clientSocket.TryConnect</w:t>
+      </w:r>
+      <w:proofErr w:type="spellEnd"/>
+      <w:r>
+        <w:t>("</w:t>
+      </w:r>
+      <w:proofErr w:type="spellStart"/>
+      <w:r>
+        <w:t>tcp</w:t>
+      </w:r>
+      <w:proofErr w:type="spellEnd"/>
+      <w:r>
+        <w:t>://127.0.0.1:5555"))</w:t>
+      </w:r>
+    </w:p>
+    <w:p>
+      <w:r>
+        <w:t xml:space="preserve">   {</w:t>
+      </w:r>
+    </w:p>
+    <w:p>
+      <w:r>
+        <w:t xml:space="preserve">       </w:t>
+      </w:r>
+      <w:proofErr w:type="spellStart"/>
+      <w:r>
+        <w:t>Console.WriteLine</w:t>
+      </w:r>
+      <w:proofErr w:type="spellEnd"/>
+      <w:r>
+        <w:t>("Waiting for server to come online...");</w:t>
+      </w:r>
+    </w:p>
+    <w:p>
+      <w:r>
+        <w:t xml:space="preserve">       await </w:t>
+      </w:r>
+      <w:proofErr w:type="spellStart"/>
+      <w:r>
+        <w:t>Task.Delay</w:t>
+      </w:r>
+      <w:proofErr w:type="spellEnd"/>
+      <w:r>
+        <w:t>(1000); // Wait and retry</w:t>
+      </w:r>
+    </w:p>
+    <w:p>
+      <w:r>
+        <w:t xml:space="preserve">   }</w:t>
+      </w:r>
+    </w:p>
+    <w:p>
+      <w:r>
+        <w:t xml:space="preserve">   ```</w:t>
+      </w:r>
+    </w:p>
+    <w:p>
+      <w:r>
+        <w:t>- **Exponential Backoff**: You can enhance the retry mechanism with an exponential backoff strategy, where the client waits increasingly longer between each retry attempt.</w:t>
+      </w:r>
+    </w:p>
+    <w:p/>
+    <w:p>
+      <w:r>
+        <w:t>- **Timeouts**: Set timeouts on the connection attempts, so that clients don’t hang indefinitely when waiting for the server to become available.</w:t>
+      </w:r>
+    </w:p>
+    <w:p/>
+    <w:p>
       <w:r>
         <w:lastRenderedPageBreak/>
-        <w:t>Appendix – Robustness</w:t>
-      </w:r>
-      <w:bookmarkEnd w:id="8"/>
-    </w:p>
-    <w:p/>
-    <w:p>
-      <w:r>
-        <w:t>When building a robust **</w:t>
-      </w:r>
-      <w:proofErr w:type="spellStart"/>
-      <w:r>
-        <w:t>NetMQ</w:t>
-      </w:r>
-      <w:proofErr w:type="spellEnd"/>
-      <w:r>
-        <w:t>** REQ-REP application, handling edge cases such as clients starting before the server, clients crashing, or network interruptions are important considerations to make the system resilient. Here are a few strategies to handle these scenarios:</w:t>
-      </w:r>
-    </w:p>
-    <w:p/>
-    <w:p>
-      <w:r>
-        <w:t>### 1. **Clients Starting Before the Server**</w:t>
-      </w:r>
-    </w:p>
-    <w:p>
-      <w:r>
-        <w:t>This can happen when clients attempt to connect to the server before it has finished starting up. The REQ-REP pattern requires an established connection, and if the server isn't available, clients will fail to connect.</w:t>
-      </w:r>
-    </w:p>
-    <w:p/>
-    <w:p>
-      <w:r>
-        <w:t>#### Solution:</w:t>
-      </w:r>
-    </w:p>
-    <w:p>
-      <w:r>
-        <w:t>- **Retry Logic**: Implement retry logic on the client side. If the client tries to send a request and the server is not up, it should wait for a moment and then retry connecting.</w:t>
-      </w:r>
-    </w:p>
-    <w:p>
-      <w:r>
-        <w:t xml:space="preserve">  </w:t>
-      </w:r>
-    </w:p>
-    <w:p>
-      <w:r>
-        <w:t xml:space="preserve">   Example:</w:t>
-      </w:r>
-    </w:p>
-    <w:p>
-      <w:r>
-        <w:t xml:space="preserve">   ```</w:t>
-      </w:r>
-      <w:proofErr w:type="spellStart"/>
-      <w:r>
-        <w:t>csharp</w:t>
-      </w:r>
-      <w:proofErr w:type="spellEnd"/>
-    </w:p>
-    <w:p>
-      <w:r>
-        <w:t xml:space="preserve">   while (!</w:t>
-      </w:r>
-      <w:proofErr w:type="spellStart"/>
-      <w:r>
-        <w:t>clientSocket.TryConnect</w:t>
-      </w:r>
-      <w:proofErr w:type="spellEnd"/>
-      <w:r>
-        <w:t>("</w:t>
-      </w:r>
-      <w:proofErr w:type="spellStart"/>
-      <w:r>
-        <w:t>tcp</w:t>
-      </w:r>
-      <w:proofErr w:type="spellEnd"/>
-      <w:r>
-        <w:t>://127.0.0.1:5555"))</w:t>
-      </w:r>
-    </w:p>
-    <w:p>
-      <w:r>
-        <w:t xml:space="preserve">   {</w:t>
-      </w:r>
-    </w:p>
-    <w:p>
-      <w:r>
-        <w:t xml:space="preserve">       </w:t>
-      </w:r>
-      <w:proofErr w:type="spellStart"/>
-      <w:r>
-        <w:t>Console.WriteLine</w:t>
-      </w:r>
-      <w:proofErr w:type="spellEnd"/>
-      <w:r>
-        <w:t>("Waiting for server to come online..."</w:t>
-      </w:r>
-      <w:proofErr w:type="gramStart"/>
-      <w:r>
-        <w:t>);</w:t>
-      </w:r>
-      <w:proofErr w:type="gramEnd"/>
-    </w:p>
-    <w:p>
-      <w:r>
-        <w:t xml:space="preserve">       await </w:t>
-      </w:r>
-      <w:proofErr w:type="spellStart"/>
-      <w:r>
-        <w:t>Task.Delay</w:t>
-      </w:r>
-      <w:proofErr w:type="spellEnd"/>
-      <w:r>
-        <w:t>(1000); // Wait and retry</w:t>
-      </w:r>
-    </w:p>
-    <w:p>
-      <w:r>
-        <w:t xml:space="preserve">   }</w:t>
-      </w:r>
-    </w:p>
-    <w:p>
-      <w:r>
-        <w:t xml:space="preserve">   ```</w:t>
-      </w:r>
-    </w:p>
-    <w:p>
-      <w:r>
-        <w:t>- **Exponential Backoff**: You can enhance the retry mechanism with an exponential backoff strategy, where the client waits increasingly longer between each retry attempt.</w:t>
-      </w:r>
-    </w:p>
-    <w:p/>
-    <w:p>
-      <w:r>
-        <w:t>- **Timeouts**: Set timeouts on the connection attempts, so that clients don’t hang indefinitely when waiting for the server to become available.</w:t>
-      </w:r>
-    </w:p>
-    <w:p/>
-    <w:p>
-      <w:r>
         <w:t xml:space="preserve">### 2. **Clients Crashing Before Receiving a </w:t>
       </w:r>
       <w:r>
@@ -1966,7 +1955,6 @@
     </w:p>
     <w:p>
       <w:r>
-        <w:lastRenderedPageBreak/>
         <w:t xml:space="preserve">This can happen if a client crashes after sending a request but before receiving the </w:t>
       </w:r>
       <w:r>

</xml_diff>

<commit_message>
The packet was inadvertently placed under helpers and had its namespace changed. It now is (and should be  in the IpcNetq namespace. Also debugging info was added to the packets "ToString"
</commit_message>
<xml_diff>
--- a/Documentation/IpcNetMq.docx
+++ b/Documentation/IpcNetMq.docx
@@ -889,7 +889,15 @@
     </w:p>
     <w:p>
       <w:r>
-        <w:t xml:space="preserve">The entire round trip </w:t>
+        <w:t xml:space="preserve">The entire </w:t>
+      </w:r>
+      <w:proofErr w:type="gramStart"/>
+      <w:r>
+        <w:t>round trip</w:t>
+      </w:r>
+      <w:proofErr w:type="gramEnd"/>
+      <w:r>
+        <w:t xml:space="preserve"> </w:t>
       </w:r>
       <w:r>
         <w:t xml:space="preserve">mechanism has been clocked at </w:t>
@@ -902,8 +910,13 @@
       </w:r>
     </w:p>
     <w:p>
-      <w:r>
-        <w:t xml:space="preserve">The communication is facilitated with a common </w:t>
+      <w:proofErr w:type="gramStart"/>
+      <w:r>
+        <w:t>The communication</w:t>
+      </w:r>
+      <w:proofErr w:type="gramEnd"/>
+      <w:r>
+        <w:t xml:space="preserve"> is facilitated with a common </w:t>
       </w:r>
       <w:r>
         <w:t>Ipc</w:t>
@@ -958,7 +971,15 @@
       </w:r>
       <w:proofErr w:type="spellEnd"/>
       <w:r>
-        <w:t xml:space="preserve"> folders for Kotlin and Java but </w:t>
+        <w:t xml:space="preserve"> folders for Kotlin and </w:t>
+      </w:r>
+      <w:proofErr w:type="gramStart"/>
+      <w:r>
+        <w:t>Java</w:t>
+      </w:r>
+      <w:proofErr w:type="gramEnd"/>
+      <w:r>
+        <w:t xml:space="preserve"> but </w:t>
       </w:r>
       <w:r>
         <w:t>they are not</w:t>
@@ -1114,11 +1135,16 @@
       <w:r>
         <w:t xml:space="preserve">During development it was decided that the IpcClient should be replaceable, and so it was implemented as an Interface. As of </w:t>
       </w:r>
+      <w:proofErr w:type="gramStart"/>
       <w:r>
         <w:t>October</w:t>
       </w:r>
       <w:r>
-        <w:t xml:space="preserve"> 2024 client mechanisms for the Open-Source ZeroMQ (0MQ) were implemented. </w:t>
+        <w:t xml:space="preserve"> 2024</w:t>
+      </w:r>
+      <w:proofErr w:type="gramEnd"/>
+      <w:r>
+        <w:t xml:space="preserve"> client mechanisms for the Open-Source ZeroMQ (0MQ) were implemented. </w:t>
       </w:r>
     </w:p>
     <w:p/>
@@ -1191,7 +1217,15 @@
         <w:t>Packet</w:t>
       </w:r>
       <w:r>
-        <w:t xml:space="preserve"> to see what the version is, and use the documentation in the appendix to see what the correct Schema is.</w:t>
+        <w:t xml:space="preserve"> to see what the version </w:t>
+      </w:r>
+      <w:proofErr w:type="gramStart"/>
+      <w:r>
+        <w:t>is, and</w:t>
+      </w:r>
+      <w:proofErr w:type="gramEnd"/>
+      <w:r>
+        <w:t xml:space="preserve"> use the documentation in the appendix to see what the correct Schema is.</w:t>
       </w:r>
     </w:p>
     <w:p>
@@ -1308,7 +1342,15 @@
     </w:p>
     <w:p>
       <w:r>
-        <w:t>The unit of communications is a</w:t>
+        <w:t xml:space="preserve">The unit of </w:t>
+      </w:r>
+      <w:proofErr w:type="gramStart"/>
+      <w:r>
+        <w:t>communications</w:t>
+      </w:r>
+      <w:proofErr w:type="gramEnd"/>
+      <w:r>
+        <w:t xml:space="preserve"> is a</w:t>
       </w:r>
       <w:r>
         <w:t>n Ipc</w:t>
@@ -1508,6 +1550,7 @@
       <w:r>
         <w:t xml:space="preserve"> As you might expect, the </w:t>
       </w:r>
+      <w:proofErr w:type="gramStart"/>
       <w:r>
         <w:t>R</w:t>
       </w:r>
@@ -1517,6 +1560,7 @@
       <w:r>
         <w:t>Reply</w:t>
       </w:r>
+      <w:proofErr w:type="gramEnd"/>
       <w:r>
         <w:t xml:space="preserve"> is handled synchronously. If you don’t care about the </w:t>
       </w:r>
@@ -1626,7 +1670,15 @@
         <w:t>th</w:t>
       </w:r>
       <w:r>
-        <w:t xml:space="preserve"> Gen Intel (i9-11900K @3.50Ghz) with 32GB Ram.</w:t>
+        <w:t xml:space="preserve"> Gen Intel (i9-11900</w:t>
+      </w:r>
+      <w:proofErr w:type="gramStart"/>
+      <w:r>
+        <w:t>K @</w:t>
+      </w:r>
+      <w:proofErr w:type="gramEnd"/>
+      <w:r>
+        <w:t>3.50Ghz) with 32GB Ram.</w:t>
       </w:r>
     </w:p>
     <w:p/>
@@ -1721,8 +1773,13 @@
       <w:r>
         <w:t xml:space="preserve"> (left padded) </w:t>
       </w:r>
-      <w:r>
-        <w:t>5 character field indicating the size of the message in ASCII-8 characters.</w:t>
+      <w:proofErr w:type="gramStart"/>
+      <w:r>
+        <w:t>5 character</w:t>
+      </w:r>
+      <w:proofErr w:type="gramEnd"/>
+      <w:r>
+        <w:t xml:space="preserve"> field indicating the size of the message in ASCII-8 characters.</w:t>
       </w:r>
     </w:p>
     <w:p/>
@@ -1903,8 +1960,13 @@
       </w:r>
       <w:proofErr w:type="spellEnd"/>
       <w:r>
-        <w:t>("Waiting for server to come online...");</w:t>
-      </w:r>
+        <w:t>("Waiting for server to come online..."</w:t>
+      </w:r>
+      <w:proofErr w:type="gramStart"/>
+      <w:r>
+        <w:t>);</w:t>
+      </w:r>
+      <w:proofErr w:type="gramEnd"/>
     </w:p>
     <w:p>
       <w:r>
@@ -2139,7 +2201,15 @@
     </w:p>
     <w:p>
       <w:r>
-        <w:t>- **Failover Mechanism**: Implement a failover strategy with backup servers. If one server goes down, the client can switch to another server. You can achieve this by setting up multiple endpoints for the client to connect to.</w:t>
+        <w:t xml:space="preserve">- **Failover Mechanism**: Implement a failover strategy with backup servers. If one server goes down, the client can switch to another server. You can achieve this by setting up multiple endpoints for the client to connect </w:t>
+      </w:r>
+      <w:proofErr w:type="gramStart"/>
+      <w:r>
+        <w:t>to</w:t>
+      </w:r>
+      <w:proofErr w:type="gramEnd"/>
+      <w:r>
+        <w:t>.</w:t>
       </w:r>
     </w:p>
     <w:p/>

</xml_diff>